<commit_message>
build(manuals): regenerate docx from validated markdown; bump to 1.0.20
Re-ran ``manuals/build_student_manual.py`` and ``build_ta_guide.py``
after the markdown fixes so the committed .docx files match the
now-validated sources.

Sizes: student 62 -> 63 KB, TA guide 60 -> 61 KB. Difference is the
new ``<!-- doc-test: skip reason=... -->`` HTML comments carried into
the .docx as regular text. Comments render visibly in Word but flag the
decision so future editors don't accidentally strip the skip markers.

Version bumped to 1.0.20 (1.0.19 shipped via PR #84).
</commit_message>
<xml_diff>
--- a/manuals/student-user-manual.docx
+++ b/manuals/student-user-manual.docx
@@ -66,7 +66,7 @@
           <w:color w:val="666666"/>
           <w:sz w:val="24"/>
         </w:rPr>
-        <w:t>April 16, 2026</w:t>
+        <w:t>April 17, 2026</w:t>
       </w:r>
     </w:p>
     <w:p>
@@ -1748,6 +1748,21 @@
       </w:r>
     </w:p>
     <w:p>
+      <w:r>
+        <w:t xml:space="preserve">&lt;!-- doc-test: skip reason="sample </w:t>
+      </w:r>
+      <w:r>
+        <w:rPr>
+          <w:rFonts w:ascii="Courier New" w:hAnsi="Courier New"/>
+          <w:sz w:val="18"/>
+        </w:rPr>
+        <w:t>list</w:t>
+      </w:r>
+      <w:r>
+        <w:t xml:space="preserve"> output, not runnable REPL input" --&gt;</w:t>
+      </w:r>
+    </w:p>
+    <w:p>
       <w:pPr>
         <w:spacing w:before="0" w:after="0" w:line="240" w:lineRule="exact"/>
         <w:shd w:fill="F0F0F0" w:val="clear"/>
@@ -3485,6 +3500,11 @@
       </w:r>
     </w:p>
     <w:p>
+      <w:r>
+        <w:t>&lt;!-- doc-test: skip reason="depends on the vtest label recorded by the preceding script" --&gt;</w:t>
+      </w:r>
+    </w:p>
+    <w:p>
       <w:pPr>
         <w:spacing w:before="0" w:after="0" w:line="240" w:lineRule="exact"/>
         <w:shd w:fill="F0F0F0" w:val="clear"/>
@@ -4170,6 +4190,11 @@
       </w:r>
     </w:p>
     <w:p>
+      <w:r>
+        <w:t>&lt;!-- doc-test: skip reason="depends on v_dmm and i_set recorded by preceding measurement steps" --&gt;</w:t>
+      </w:r>
+    </w:p>
+    <w:p>
       <w:pPr>
         <w:spacing w:before="0" w:after="0" w:line="240" w:lineRule="exact"/>
         <w:shd w:fill="F0F0F0" w:val="clear"/>
@@ -4613,6 +4638,11 @@
       </w:r>
     </w:p>
     <w:p>
+      <w:r>
+        <w:t>&lt;!-- doc-test: skip reason="prose caption example, not REPL input" --&gt;</w:t>
+      </w:r>
+    </w:p>
+    <w:p>
       <w:pPr>
         <w:spacing w:before="0" w:after="0" w:line="240" w:lineRule="exact"/>
         <w:shd w:fill="F0F0F0" w:val="clear"/>
@@ -5078,6 +5108,11 @@
     <w:p>
       <w:r>
         <w:t>You can do math directly in assignments:</w:t>
+      </w:r>
+    </w:p>
+    <w:p>
+      <w:r>
+        <w:t>&lt;!-- doc-test: skip reason="reference example -- voltage/current aren't set in this block" --&gt;</w:t>
       </w:r>
     </w:p>
     <w:p>
@@ -7711,6 +7746,11 @@
       </w:r>
     </w:p>
     <w:p>
+      <w:r>
+        <w:t>&lt;!-- doc-test: skip reason="reference example -- voltage not set in this block" --&gt;</w:t>
+      </w:r>
+    </w:p>
+    <w:p>
       <w:pPr>
         <w:spacing w:before="0" w:after="0" w:line="240" w:lineRule="exact"/>
         <w:shd w:fill="F0F0F0" w:val="clear"/>
@@ -7757,6 +7797,11 @@
       </w:r>
     </w:p>
     <w:p>
+      <w:r>
+        <w:t>&lt;!-- doc-test: skip reason="reference example -- voltage not set in this block" --&gt;</w:t>
+      </w:r>
+    </w:p>
+    <w:p>
       <w:pPr>
         <w:spacing w:before="0" w:after="0" w:line="240" w:lineRule="exact"/>
         <w:shd w:fill="F0F0F0" w:val="clear"/>
@@ -7817,6 +7862,11 @@
       </w:r>
     </w:p>
     <w:p>
+      <w:r>
+        <w:t>&lt;!-- doc-test: skip reason="pause prompts operator for interactive Enter" --&gt;</w:t>
+      </w:r>
+    </w:p>
+    <w:p>
       <w:pPr>
         <w:spacing w:before="0" w:after="0" w:line="240" w:lineRule="exact"/>
         <w:shd w:fill="F0F0F0" w:val="clear"/>
@@ -7947,6 +7997,11 @@
       </w:pPr>
       <w:r>
         <w:t>Calling Sub-Scripts</w:t>
+      </w:r>
+    </w:p>
+    <w:p>
+      <w:r>
+        <w:t>&lt;!-- doc-test: skip reason="requires a saved sub-script named other_script on disk" --&gt;</w:t>
       </w:r>
     </w:p>
     <w:p>
@@ -8174,6 +8229,21 @@
       </w:r>
     </w:p>
     <w:p>
+      <w:r>
+        <w:t xml:space="preserve">&lt;!-- doc-test: skip reason="breakpoint only fires under </w:t>
+      </w:r>
+      <w:r>
+        <w:rPr>
+          <w:rFonts w:ascii="Courier New" w:hAnsi="Courier New"/>
+          <w:sz w:val="18"/>
+        </w:rPr>
+        <w:t>script debug</w:t>
+      </w:r>
+      <w:r>
+        <w:t>, not at the onecmd prompt" --&gt;</w:t>
+      </w:r>
+    </w:p>
+    <w:p>
       <w:pPr>
         <w:spacing w:before="0" w:after="0" w:line="240" w:lineRule="exact"/>
         <w:shd w:fill="F0F0F0" w:val="clear"/>
@@ -8709,6 +8779,11 @@
       </w:r>
     </w:p>
     <w:p>
+      <w:r>
+        <w:t>&lt;!-- doc-test: skip reason="reference example -- requires a multi-PSU / multi-DMM lab setup (psu2, dmm2)" --&gt;</w:t>
+      </w:r>
+    </w:p>
+    <w:p>
       <w:pPr>
         <w:spacing w:before="0" w:after="0" w:line="240" w:lineRule="exact"/>
         <w:shd w:fill="F0F0F0" w:val="clear"/>
@@ -9852,6 +9927,11 @@
       </w:r>
     </w:p>
     <w:p>
+      <w:r>
+        <w:t>&lt;!-- doc-test: skip reason="requires dual-PSU lab setup; psu1 track + psu2 not present in single-PSU mock" --&gt;</w:t>
+      </w:r>
+    </w:p>
+    <w:p>
       <w:pPr>
         <w:spacing w:before="0" w:after="0" w:line="240" w:lineRule="exact"/>
         <w:shd w:fill="F0F0F0" w:val="clear"/>
@@ -10075,6 +10155,11 @@
       </w:r>
     </w:p>
     <w:p>
+      <w:r>
+        <w:t>&lt;!-- doc-test: skip reason="requires 2x DMM lab setup and a real DUT at 3.3 V (check fails against unconfigured mock)" --&gt;</w:t>
+      </w:r>
+    </w:p>
+    <w:p>
       <w:pPr>
         <w:spacing w:before="0" w:after="0" w:line="240" w:lineRule="exact"/>
         <w:shd w:fill="F0F0F0" w:val="clear"/>
@@ -10538,6 +10623,11 @@
     <w:p>
       <w:r>
         <w:t>Or shut down individually:</w:t>
+      </w:r>
+    </w:p>
+    <w:p>
+      <w:r>
+        <w:t>&lt;!-- doc-test: skip reason="references psu2 which isn't in the single-PSU mock" --&gt;</w:t>
       </w:r>
     </w:p>
     <w:p>

</xml_diff>

<commit_message>
fix(manuals): skip 'script new' doc-test block (needs stdin); regen docx
</commit_message>
<xml_diff>
--- a/manuals/student-user-manual.docx
+++ b/manuals/student-user-manual.docx
@@ -66,7 +66,7 @@
           <w:color w:val="666666"/>
           <w:sz w:val="24"/>
         </w:rPr>
-        <w:t>April 21, 2026</w:t>
+        <w:t>April 26, 2026</w:t>
       </w:r>
     </w:p>
     <w:p>
@@ -6850,6 +6850,11 @@
       </w:pPr>
       <w:r>
         <w:t>Method 1: Script Editor</w:t>
+      </w:r>
+    </w:p>
+    <w:p>
+      <w:r>
+        <w:t>&lt;!-- doc-test: skip reason="opens editor and prompts for confirmation if script exists; needs stdin" --&gt;</w:t>
       </w:r>
     </w:p>
     <w:p>

</xml_diff>